<commit_message>
EXOS-EXP-001-0: add new-vendor onboarding path + explicit NDA-before-drawings gate
Task 2 now covers the not-in-CRM case: requestor adds the company to the
Mission Control CRM and Exobot runs DD FIRST; nothing (RFQ/specs/NDA/drawings)
goes to the vendor until DD clears. Task 3 makes the signed NDA a hard gate
before any drawings/specs are released. Draft.

Co-Authored-By: Claude Opus 4.8 <noreply@anthropic.com>
</commit_message>
<xml_diff>
--- a/process-library/04-procurement/EXOS-EXP-001-0_ITAR-EAR-Compliant_Supplier_Manufacturing_Request_Procedure.docx
+++ b/process-library/04-procurement/EXOS-EXP-001-0_ITAR-EAR-Compliant_Supplier_Manufacturing_Request_Procedure.docx
@@ -263,7 +263,7 @@
           <w:color w:val="1C1C1C"/>
           <w:sz w:val="21"/>
         </w:rPr>
-        <w:t>Exos rocket parts and their technical data (drawings, CAD models, specifications, dimensions, materials, and processes) are frequently ITAR-controlled defense articles and technical data (for example USML Category IV launch-vehicle components or Category XV spacecraft components) or are controlled under the EAR. Releasing that technical data to a supplier - even a domestic one - can be an export or a deemed export if a foreign person accesses it. Accordingly, every supplier manufacturing request is gated behind four controls: (1) an export jurisdiction and classification determination for both the part and the technical data; (2) a requirement that the supplier be U.S.-domiciled, already in Mission Control, and cleared through Exos due diligence; (3) technical-data marking, minimization, and access control; and (4) written Empowered Official authorization before any controlled technical data is released or any purchase order is issued. This procedure applies to any request to have a supplier fabricate, machine, build, or process a rocket part or component from Exos-furnished technical data. It does not authorize foreign suppliers, foreign places of performance, or foreign-person access - any of those stops the process and routes to the Empowered Official.</w:t>
+        <w:t>Exos rocket parts and their technical data (drawings, CAD models, specifications, dimensions, materials, and processes) are frequently ITAR-controlled defense articles and technical data (for example USML Category IV launch-vehicle components or Category XV spacecraft components) or are controlled under the EAR. Releasing that technical data to a supplier - even a domestic one - can be an export or a deemed export if a foreign person accesses it. Accordingly, every supplier manufacturing request is gated behind four controls: (1) an export jurisdiction and classification determination for both the part and the technical data; (2) a requirement that the supplier be U.S.-domiciled, already in Mission Control, and cleared through Exos due diligence; (3) technical-data marking, minimization, and access control; and (4) written Empowered Official authorization before any controlled technical data is released or any purchase order is issued. This procedure applies to any request to have a supplier fabricate, machine, build, or process a rocket part or component from Exos-furnished technical data. It does not authorize foreign suppliers, foreign places of performance, or foreign-person access - any of those stops the process and routes to the Empowered Official. If a vendor is not already in Mission Control, the requestor must add the company to the CRM and have Exobot complete due diligence before anything is sent to the vendor, and a signed NDA is required before any drawings or specifications are released.</w:t>
       </w:r>
     </w:p>
     <w:p>
@@ -444,7 +444,7 @@
           <w:color w:val="0B2A4A"/>
           <w:sz w:val="22"/>
         </w:rPr>
-        <w:t>Task 2 - Select an Eligible U.S., DD-Cleared Supplier from Mission Control</w:t>
+        <w:t>Task 2 - Confirm the Vendor Is in Mission Control and DD-Cleared, or Onboard It First</w:t>
       </w:r>
     </w:p>
     <w:p>
@@ -470,7 +470,7 @@
           <w:color w:val="1C1C1C"/>
           <w:sz w:val="21"/>
         </w:rPr>
-        <w:t>Select the supplier ONLY from the Exos Mission Control supplier registry; never initiate a controlled manufacturing request with a supplier that is not already in Mission Control.</w:t>
+        <w:t>Check whether the vendor already exists in the Exos Mission Control CRM / supplier registry.</w:t>
       </w:r>
     </w:p>
     <w:p>
@@ -496,7 +496,7 @@
           <w:color w:val="1C1C1C"/>
           <w:sz w:val="21"/>
         </w:rPr>
-        <w:t>Confirm the supplier's Due Diligence status is CLEARED in the Mission Control supplier DD registry (OFAC/denied-parties, SAM, debarment, and FOCI screening complete and passing).</w:t>
+        <w:t>If the vendor is NOT already in the CRM, the requestor must add the company to the Mission Control CRM and request Exobot due diligence FIRST; do not contact the vendor or send anything - no request for quote, specifications, NDA, or drawings - until the vendor is onboarded and its due diligence is complete and CLEARED.</w:t>
       </w:r>
     </w:p>
     <w:p>
@@ -522,7 +522,7 @@
           <w:color w:val="1C1C1C"/>
           <w:sz w:val="21"/>
         </w:rPr>
-        <w:t>Verify the supplier is a U.S.-domiciled entity that will perform the work in the United States; reject any foreign supplier or foreign place of performance - this procedure is U.S.-only by design.</w:t>
+        <w:t>Confirm the vendor's Due Diligence status is CLEARED in the Mission Control supplier DD registry (OFAC/denied-parties, SAM, debarment, and FOCI screening complete and passing); do not proceed while due diligence is pending or failed.</w:t>
       </w:r>
     </w:p>
     <w:p>
@@ -548,7 +548,7 @@
           <w:color w:val="1C1C1C"/>
           <w:sz w:val="21"/>
         </w:rPr>
-        <w:t>Confirm the supplier is not on any denied or debarred list (ITAR 22 CFR 127.7 debarred parties, EAR Denied Persons and Entity List, OFAC SDN, SAM exclusions); if the DD clearance is older than the Exos re-screen interval, request a fresh screen before proceeding.</w:t>
+        <w:t>Verify the vendor is a U.S.-domiciled entity that will perform the work in the United States; reject any foreign supplier or foreign place of performance - this procedure is U.S.-only by design.</w:t>
       </w:r>
     </w:p>
     <w:p>
@@ -574,7 +574,33 @@
           <w:color w:val="1C1C1C"/>
           <w:sz w:val="21"/>
         </w:rPr>
-        <w:t>If the supplier is U.S.-domiciled but has foreign-person employees or foreign ownership, control, or influence (FOCI), STOP and route to the Empowered Official - releasing technical data may be a deemed export requiring separate authorization or access controls.</w:t>
+        <w:t>Confirm the vendor is not on any denied or debarred list (ITAR 22 CFR 127.7 debarred parties, EAR Denied Persons and Entity List, OFAC SDN, SAM exclusions); if the DD clearance is older than the Exos re-screen interval, request a fresh Exobot screen before proceeding.</w:t>
+      </w:r>
+    </w:p>
+    <w:p>
+      <w:pPr>
+        <w:spacing w:after="60"/>
+        <w:ind w:left="360"/>
+      </w:pPr>
+      <w:r>
+        <w:rPr>
+          <w:rFonts w:ascii="Calibri" w:hAnsi="Calibri"/>
+          <w:b w:val="0"/>
+          <w:i w:val="0"/>
+          <w:color w:val="0B2A4A"/>
+          <w:sz w:val="24"/>
+        </w:rPr>
+        <w:t xml:space="preserve">☐  </w:t>
+      </w:r>
+      <w:r>
+        <w:rPr>
+          <w:rFonts w:ascii="Calibri" w:hAnsi="Calibri"/>
+          <w:b w:val="0"/>
+          <w:i w:val="0"/>
+          <w:color w:val="1C1C1C"/>
+          <w:sz w:val="21"/>
+        </w:rPr>
+        <w:t>If the vendor is U.S.-domiciled but has foreign-person employees or foreign ownership, control, or influence (FOCI), STOP and route to the Empowered Official - releasing technical data may be a deemed export requiring separate authorization or access controls.</w:t>
       </w:r>
     </w:p>
     <w:p>
@@ -616,7 +642,7 @@
           <w:color w:val="1C1C1C"/>
           <w:sz w:val="21"/>
         </w:rPr>
-        <w:t>Ensure a current nondisclosure / proprietary-information agreement that includes an export-control clause is executed with the supplier before any technical data is shared.</w:t>
+        <w:t>A fully executed nondisclosure / proprietary-information agreement (NDA) that includes an export-control clause is REQUIRED before any drawings or technical data are sent to the vendor - no drawings or specifications go out until the NDA is signed and on file.</w:t>
       </w:r>
     </w:p>
     <w:p>

</xml_diff>

<commit_message>
EXOS-EXP-001-0: add Task 7 (ask Exobot / escalate to manager) + APPROVE
Adds clarification-and-escalation step: ask Exobot for help as needed, escalate
to a manager for additional support once all items complete. Status Draft->Approved
(John Quinn, CEO, 2026-08-28).

Co-Authored-By: Claude Opus 4.8 <noreply@anthropic.com>
</commit_message>
<xml_diff>
--- a/process-library/04-procurement/EXOS-EXP-001-0_ITAR-EAR-Compliant_Supplier_Manufacturing_Request_Procedure.docx
+++ b/process-library/04-procurement/EXOS-EXP-001-0_ITAR-EAR-Compliant_Supplier_Manufacturing_Request_Procedure.docx
@@ -77,7 +77,7 @@
           <w:color w:val="1C1C1C"/>
           <w:sz w:val="18"/>
         </w:rPr>
-        <w:t>DRAFT</w:t>
+        <w:t>APPROVED</w:t>
       </w:r>
     </w:p>
     <w:p>
@@ -1111,6 +1111,74 @@
     </w:p>
     <w:p>
       <w:pPr>
+        <w:keepNext/>
+        <w:spacing w:before="140" w:after="60"/>
+      </w:pPr>
+      <w:r>
+        <w:rPr>
+          <w:rFonts w:ascii="Calibri" w:hAnsi="Calibri"/>
+          <w:b/>
+          <w:i w:val="0"/>
+          <w:color w:val="0B2A4A"/>
+          <w:sz w:val="22"/>
+        </w:rPr>
+        <w:t>Task 7 - Get Clarification and Escalate</w:t>
+      </w:r>
+    </w:p>
+    <w:p>
+      <w:pPr>
+        <w:spacing w:after="60"/>
+        <w:ind w:left="360"/>
+      </w:pPr>
+      <w:r>
+        <w:rPr>
+          <w:rFonts w:ascii="Calibri" w:hAnsi="Calibri"/>
+          <w:b w:val="0"/>
+          <w:i w:val="0"/>
+          <w:color w:val="0B2A4A"/>
+          <w:sz w:val="24"/>
+        </w:rPr>
+        <w:t xml:space="preserve">☐  </w:t>
+      </w:r>
+      <w:r>
+        <w:rPr>
+          <w:rFonts w:ascii="Calibri" w:hAnsi="Calibri"/>
+          <w:b w:val="0"/>
+          <w:i w:val="0"/>
+          <w:color w:val="1C1C1C"/>
+          <w:sz w:val="21"/>
+        </w:rPr>
+        <w:t>At any point in this procedure, ask Exobot for clarification or assistance if a step is unclear or you need help - for example with export classification, a vendor's due diligence status, technical-data markings, or assembling the release package.</w:t>
+      </w:r>
+    </w:p>
+    <w:p>
+      <w:pPr>
+        <w:spacing w:after="60"/>
+        <w:ind w:left="360"/>
+      </w:pPr>
+      <w:r>
+        <w:rPr>
+          <w:rFonts w:ascii="Calibri" w:hAnsi="Calibri"/>
+          <w:b w:val="0"/>
+          <w:i w:val="0"/>
+          <w:color w:val="0B2A4A"/>
+          <w:sz w:val="24"/>
+        </w:rPr>
+        <w:t xml:space="preserve">☐  </w:t>
+      </w:r>
+      <w:r>
+        <w:rPr>
+          <w:rFonts w:ascii="Calibri" w:hAnsi="Calibri"/>
+          <w:b w:val="0"/>
+          <w:i w:val="0"/>
+          <w:color w:val="1C1C1C"/>
+          <w:sz w:val="21"/>
+        </w:rPr>
+        <w:t>Once all items in this procedure are completed, escalate to your manager for additional support and final review.</w:t>
+      </w:r>
+    </w:p>
+    <w:p>
+      <w:pPr>
         <w:spacing w:before="140" w:after="60"/>
       </w:pPr>
       <w:r>

</xml_diff>